<commit_message>
Updates from the latest review and retesting the DOCX templates are properly generating.
</commit_message>
<xml_diff>
--- a/docassemble/ParentingTimeSchedule/data/templates/Order.docx
+++ b/docassemble/ParentingTimeSchedule/data/templates/Order.docx
@@ -925,7 +925,7 @@
         <w:rPr>
           <w:rFonts w:ascii="Arial" w:hAnsi="Arial" w:cs="Arial"/>
         </w:rPr>
-        <w:t>() }}, heard all the evidence of the parties, and been fully advised as to the situation of the family. The Court finds that the Petition should be granted.</w:t>
+        <w:t>() }}, heard all the evidence of the parties, and been fully advised as to the situation of the family. The Court finds that the Motion should be granted.</w:t>
       </w:r>
     </w:p>
     <w:p>
@@ -7041,6 +7041,14 @@
           <w:rFonts w:ascii="Arial" w:hAnsi="Arial" w:cs="Arial"/>
         </w:rPr>
       </w:pPr>
+    </w:p>
+    <w:p>
+      <w:pPr>
+        <w:spacing w:after="0"/>
+        <w:rPr>
+          <w:rFonts w:ascii="Arial" w:hAnsi="Arial" w:cs="Arial"/>
+        </w:rPr>
+      </w:pPr>
       <w:r>
         <w:rPr>
           <w:rFonts w:ascii="Arial" w:hAnsi="Arial" w:cs="Arial"/>
@@ -7121,19 +7129,7 @@
         <w:rPr>
           <w:rFonts w:ascii="Arial" w:hAnsi="Arial" w:cs="Arial"/>
         </w:rPr>
-        <w:t>{%</w:t>
-      </w:r>
-      <w:r>
-        <w:rPr>
-          <w:rFonts w:ascii="Arial" w:hAnsi="Arial" w:cs="Arial"/>
-        </w:rPr>
-        <w:t>p</w:t>
-      </w:r>
-      <w:r>
-        <w:rPr>
-          <w:rFonts w:ascii="Arial" w:hAnsi="Arial" w:cs="Arial"/>
-        </w:rPr>
-        <w:t xml:space="preserve"> if </w:t>
+        <w:t xml:space="preserve">{%p if </w:t>
       </w:r>
       <w:proofErr w:type="spellStart"/>
       <w:r>
@@ -7161,19 +7157,7 @@
         <w:rPr>
           <w:rFonts w:ascii="Arial" w:hAnsi="Arial" w:cs="Arial"/>
         </w:rPr>
-        <w:t>)</w:t>
-      </w:r>
-      <w:r>
-        <w:rPr>
-          <w:rFonts w:ascii="Arial" w:hAnsi="Arial" w:cs="Arial"/>
-        </w:rPr>
-        <w:t xml:space="preserve"> </w:t>
-      </w:r>
-      <w:r>
-        <w:rPr>
-          <w:rFonts w:ascii="Arial" w:hAnsi="Arial" w:cs="Arial"/>
-        </w:rPr>
-        <w:t xml:space="preserve">or </w:t>
+        <w:t>) or (</w:t>
       </w:r>
       <w:proofErr w:type="spellStart"/>
       <w:r>
@@ -7187,6 +7171,34 @@
         <w:rPr>
           <w:rFonts w:ascii="Arial" w:hAnsi="Arial" w:cs="Arial"/>
         </w:rPr>
+        <w:t>holidays.there</w:t>
+      </w:r>
+      <w:proofErr w:type="gramEnd"/>
+      <w:r>
+        <w:rPr>
+          <w:rFonts w:ascii="Arial" w:hAnsi="Arial" w:cs="Arial"/>
+        </w:rPr>
+        <w:t>_are_any</w:t>
+      </w:r>
+      <w:proofErr w:type="spellEnd"/>
+      <w:r>
+        <w:rPr>
+          <w:rFonts w:ascii="Arial" w:hAnsi="Arial" w:cs="Arial"/>
+        </w:rPr>
+        <w:t xml:space="preserve"> and </w:t>
+      </w:r>
+      <w:proofErr w:type="spellStart"/>
+      <w:r>
+        <w:rPr>
+          <w:rFonts w:ascii="Arial" w:hAnsi="Arial" w:cs="Arial"/>
+        </w:rPr>
+        <w:t>other_</w:t>
+      </w:r>
+      <w:proofErr w:type="gramStart"/>
+      <w:r>
+        <w:rPr>
+          <w:rFonts w:ascii="Arial" w:hAnsi="Arial" w:cs="Arial"/>
+        </w:rPr>
         <w:t>holidays.number</w:t>
       </w:r>
       <w:proofErr w:type="gramEnd"/>
@@ -7215,24 +7227,22 @@
         <w:rPr>
           <w:rFonts w:ascii="Arial" w:hAnsi="Arial" w:cs="Arial"/>
         </w:rPr>
-        <w:t xml:space="preserve">) &gt; </w:t>
+        <w:t>) &gt; 0</w:t>
       </w:r>
       <w:proofErr w:type="gramStart"/>
       <w:r>
         <w:rPr>
           <w:rFonts w:ascii="Arial" w:hAnsi="Arial" w:cs="Arial"/>
         </w:rPr>
-        <w:t>0 %}</w:t>
+        <w:t>) %</w:t>
+      </w:r>
+      <w:r>
+        <w:rPr>
+          <w:rFonts w:ascii="Arial" w:hAnsi="Arial" w:cs="Arial"/>
+        </w:rPr>
+        <w:t>}</w:t>
       </w:r>
       <w:proofErr w:type="gramEnd"/>
-    </w:p>
-    <w:p>
-      <w:pPr>
-        <w:spacing w:after="0"/>
-        <w:rPr>
-          <w:rFonts w:ascii="Arial" w:hAnsi="Arial" w:cs="Arial"/>
-        </w:rPr>
-      </w:pPr>
     </w:p>
     <w:p>
       <w:pPr>
@@ -7662,188 +7672,179 @@
             </w:pPr>
             <w:proofErr w:type="gramStart"/>
             <w:r>
-              <w:t xml:space="preserve">{{ </w:t>
-            </w:r>
-            <w:proofErr w:type="spellStart"/>
-            <w:r>
-              <w:t>holiday</w:t>
-            </w:r>
-            <w:proofErr w:type="gramEnd"/>
-            <w:r>
-              <w:t>_name</w:t>
-            </w:r>
-            <w:proofErr w:type="spellEnd"/>
-            <w:r>
-              <w:t xml:space="preserve"> }}</w:t>
-            </w:r>
-          </w:p>
-        </w:tc>
-        <w:tc>
-          <w:tcPr>
-            <w:tcW w:w="1584" w:type="dxa"/>
-          </w:tcPr>
-          <w:p>
-            <w:pPr>
-              <w:jc w:val="center"/>
-              <w:rPr>
-                <w:rFonts w:ascii="Arial" w:hAnsi="Arial" w:cs="Arial"/>
-              </w:rPr>
-            </w:pPr>
-            <w:proofErr w:type="gramStart"/>
-            <w:r>
-              <w:t>{{ users</w:t>
-            </w:r>
-            <w:proofErr w:type="gramEnd"/>
-            <w:r>
-              <w:t>[0].</w:t>
-            </w:r>
-            <w:proofErr w:type="spellStart"/>
-            <w:proofErr w:type="gramStart"/>
-            <w:r>
-              <w:t>na</w:t>
-            </w:r>
-            <w:r>
-              <w:lastRenderedPageBreak/>
-              <w:t>me.initials</w:t>
-            </w:r>
-            <w:proofErr w:type="spellEnd"/>
-            <w:proofErr w:type="gramEnd"/>
-            <w:r>
-              <w:t xml:space="preserve"> if </w:t>
-            </w:r>
-            <w:proofErr w:type="spellStart"/>
-            <w:proofErr w:type="gramStart"/>
-            <w:r>
-              <w:t>holiday.holiday</w:t>
-            </w:r>
-            <w:proofErr w:type="gramEnd"/>
-            <w:r>
-              <w:t>_year</w:t>
-            </w:r>
-            <w:proofErr w:type="spellEnd"/>
-            <w:r>
-              <w:t xml:space="preserve"> in ['me', 'odd'] else </w:t>
-            </w:r>
-            <w:proofErr w:type="spellStart"/>
-            <w:r>
-              <w:t>other_</w:t>
-            </w:r>
-            <w:proofErr w:type="gramStart"/>
-            <w:r>
-              <w:t>parties</w:t>
-            </w:r>
-            <w:proofErr w:type="spellEnd"/>
-            <w:r>
-              <w:t>[</w:t>
-            </w:r>
-            <w:proofErr w:type="gramEnd"/>
-            <w:r>
-              <w:t>0].</w:t>
-            </w:r>
-            <w:proofErr w:type="spellStart"/>
-            <w:proofErr w:type="gramStart"/>
-            <w:r>
-              <w:t>name.initials</w:t>
-            </w:r>
-            <w:proofErr w:type="spellEnd"/>
-            <w:proofErr w:type="gramEnd"/>
-            <w:r>
-              <w:t xml:space="preserve"> }}</w:t>
-            </w:r>
-          </w:p>
-        </w:tc>
-        <w:tc>
-          <w:tcPr>
-            <w:tcW w:w="1584" w:type="dxa"/>
-          </w:tcPr>
-          <w:p>
-            <w:pPr>
-              <w:jc w:val="center"/>
-              <w:rPr>
-                <w:rFonts w:ascii="Arial" w:hAnsi="Arial" w:cs="Arial"/>
-              </w:rPr>
-            </w:pPr>
-            <w:proofErr w:type="gramStart"/>
-            <w:r>
-              <w:lastRenderedPageBreak/>
-              <w:t>{{ users</w:t>
-            </w:r>
-            <w:proofErr w:type="gramEnd"/>
-            <w:r>
-              <w:t>[0].</w:t>
-            </w:r>
-            <w:proofErr w:type="spellStart"/>
-            <w:proofErr w:type="gramStart"/>
-            <w:r>
-              <w:t>na</w:t>
-            </w:r>
-            <w:r>
-              <w:lastRenderedPageBreak/>
-              <w:t>me.initials</w:t>
-            </w:r>
-            <w:proofErr w:type="spellEnd"/>
-            <w:proofErr w:type="gramEnd"/>
-            <w:r>
-              <w:t xml:space="preserve"> if </w:t>
-            </w:r>
-            <w:proofErr w:type="spellStart"/>
-            <w:proofErr w:type="gramStart"/>
-            <w:r>
-              <w:t>holiday.holiday</w:t>
-            </w:r>
-            <w:proofErr w:type="gramEnd"/>
-            <w:r>
-              <w:t>_year</w:t>
-            </w:r>
-            <w:proofErr w:type="spellEnd"/>
-            <w:r>
-              <w:t xml:space="preserve"> in ['me', 'even'] else </w:t>
-            </w:r>
-            <w:proofErr w:type="spellStart"/>
-            <w:r>
-              <w:t>other_</w:t>
-            </w:r>
-            <w:proofErr w:type="gramStart"/>
-            <w:r>
-              <w:t>parties</w:t>
-            </w:r>
-            <w:proofErr w:type="spellEnd"/>
-            <w:r>
-              <w:t>[</w:t>
-            </w:r>
-            <w:proofErr w:type="gramEnd"/>
-            <w:r>
-              <w:t>0].</w:t>
-            </w:r>
-            <w:proofErr w:type="spellStart"/>
-            <w:proofErr w:type="gramStart"/>
-            <w:r>
-              <w:t>name.initials</w:t>
-            </w:r>
-            <w:proofErr w:type="spellEnd"/>
-            <w:proofErr w:type="gramEnd"/>
-            <w:r>
-              <w:t xml:space="preserve"> }}</w:t>
-            </w:r>
-          </w:p>
-        </w:tc>
-        <w:tc>
-          <w:tcPr>
-            <w:tcW w:w="2016" w:type="dxa"/>
-          </w:tcPr>
-          <w:p>
-            <w:pPr>
-              <w:rPr>
-                <w:rFonts w:ascii="Arial" w:hAnsi="Arial" w:cs="Arial"/>
-              </w:rPr>
-            </w:pPr>
-            <w:proofErr w:type="gramStart"/>
-            <w:r>
               <w:lastRenderedPageBreak/>
               <w:t xml:space="preserve">{{ </w:t>
             </w:r>
             <w:proofErr w:type="spellStart"/>
             <w:r>
+              <w:t>holiday</w:t>
+            </w:r>
+            <w:proofErr w:type="gramEnd"/>
+            <w:r>
+              <w:t>_name</w:t>
+            </w:r>
+            <w:proofErr w:type="spellEnd"/>
+            <w:r>
+              <w:t xml:space="preserve"> }}</w:t>
+            </w:r>
+          </w:p>
+        </w:tc>
+        <w:tc>
+          <w:tcPr>
+            <w:tcW w:w="1584" w:type="dxa"/>
+          </w:tcPr>
+          <w:p>
+            <w:pPr>
+              <w:jc w:val="center"/>
+              <w:rPr>
+                <w:rFonts w:ascii="Arial" w:hAnsi="Arial" w:cs="Arial"/>
+              </w:rPr>
+            </w:pPr>
+            <w:proofErr w:type="gramStart"/>
+            <w:r>
+              <w:t>{{ users</w:t>
+            </w:r>
+            <w:proofErr w:type="gramEnd"/>
+            <w:r>
+              <w:t>[0].</w:t>
+            </w:r>
+            <w:proofErr w:type="spellStart"/>
+            <w:proofErr w:type="gramStart"/>
+            <w:r>
+              <w:t>name.initials</w:t>
+            </w:r>
+            <w:proofErr w:type="spellEnd"/>
+            <w:proofErr w:type="gramEnd"/>
+            <w:r>
+              <w:t xml:space="preserve"> if </w:t>
+            </w:r>
+            <w:proofErr w:type="spellStart"/>
+            <w:proofErr w:type="gramStart"/>
+            <w:r>
+              <w:t>holiday.holiday</w:t>
+            </w:r>
+            <w:proofErr w:type="gramEnd"/>
+            <w:r>
+              <w:t>_year</w:t>
+            </w:r>
+            <w:proofErr w:type="spellEnd"/>
+            <w:r>
+              <w:t xml:space="preserve"> in ['me', 'odd'] else </w:t>
+            </w:r>
+            <w:proofErr w:type="spellStart"/>
+            <w:r>
+              <w:t>other_</w:t>
+            </w:r>
+            <w:proofErr w:type="gramStart"/>
+            <w:r>
+              <w:t>parties</w:t>
+            </w:r>
+            <w:proofErr w:type="spellEnd"/>
+            <w:r>
+              <w:t>[</w:t>
+            </w:r>
+            <w:proofErr w:type="gramEnd"/>
+            <w:r>
+              <w:t>0].</w:t>
+            </w:r>
+            <w:proofErr w:type="spellStart"/>
+            <w:proofErr w:type="gramStart"/>
+            <w:r>
+              <w:t>name.initials</w:t>
+            </w:r>
+            <w:proofErr w:type="spellEnd"/>
+            <w:proofErr w:type="gramEnd"/>
+            <w:r>
+              <w:t xml:space="preserve"> }}</w:t>
+            </w:r>
+          </w:p>
+        </w:tc>
+        <w:tc>
+          <w:tcPr>
+            <w:tcW w:w="1584" w:type="dxa"/>
+          </w:tcPr>
+          <w:p>
+            <w:pPr>
+              <w:jc w:val="center"/>
+              <w:rPr>
+                <w:rFonts w:ascii="Arial" w:hAnsi="Arial" w:cs="Arial"/>
+              </w:rPr>
+            </w:pPr>
+            <w:proofErr w:type="gramStart"/>
+            <w:r>
+              <w:t>{{ users</w:t>
+            </w:r>
+            <w:proofErr w:type="gramEnd"/>
+            <w:r>
+              <w:t>[0].</w:t>
+            </w:r>
+            <w:proofErr w:type="spellStart"/>
+            <w:proofErr w:type="gramStart"/>
+            <w:r>
+              <w:t>name.initials</w:t>
+            </w:r>
+            <w:proofErr w:type="spellEnd"/>
+            <w:proofErr w:type="gramEnd"/>
+            <w:r>
+              <w:t xml:space="preserve"> if </w:t>
+            </w:r>
+            <w:proofErr w:type="spellStart"/>
+            <w:proofErr w:type="gramStart"/>
+            <w:r>
+              <w:t>holiday.holiday</w:t>
+            </w:r>
+            <w:proofErr w:type="gramEnd"/>
+            <w:r>
+              <w:t>_year</w:t>
+            </w:r>
+            <w:proofErr w:type="spellEnd"/>
+            <w:r>
+              <w:t xml:space="preserve"> in ['me', 'even'] else </w:t>
+            </w:r>
+            <w:proofErr w:type="spellStart"/>
+            <w:r>
+              <w:t>other_</w:t>
+            </w:r>
+            <w:proofErr w:type="gramStart"/>
+            <w:r>
+              <w:t>parties</w:t>
+            </w:r>
+            <w:proofErr w:type="spellEnd"/>
+            <w:r>
+              <w:t>[</w:t>
+            </w:r>
+            <w:proofErr w:type="gramEnd"/>
+            <w:r>
+              <w:t>0].</w:t>
+            </w:r>
+            <w:proofErr w:type="spellStart"/>
+            <w:proofErr w:type="gramStart"/>
+            <w:r>
+              <w:t>name.initials</w:t>
+            </w:r>
+            <w:proofErr w:type="spellEnd"/>
+            <w:proofErr w:type="gramEnd"/>
+            <w:r>
+              <w:t xml:space="preserve"> }}</w:t>
+            </w:r>
+          </w:p>
+        </w:tc>
+        <w:tc>
+          <w:tcPr>
+            <w:tcW w:w="2016" w:type="dxa"/>
+          </w:tcPr>
+          <w:p>
+            <w:pPr>
+              <w:rPr>
+                <w:rFonts w:ascii="Arial" w:hAnsi="Arial" w:cs="Arial"/>
+              </w:rPr>
+            </w:pPr>
+            <w:proofErr w:type="gramStart"/>
+            <w:r>
+              <w:t xml:space="preserve">{{ </w:t>
+            </w:r>
+            <w:proofErr w:type="spellStart"/>
+            <w:r>
               <w:t>format</w:t>
             </w:r>
             <w:proofErr w:type="gramEnd"/>
@@ -7860,11 +7861,7 @@
             </w:r>
             <w:proofErr w:type="spellStart"/>
             <w:r>
-              <w:t>holi</w:t>
-            </w:r>
-            <w:r>
-              <w:lastRenderedPageBreak/>
-              <w:t>day.holiday</w:t>
+              <w:t>holiday.holiday</w:t>
             </w:r>
             <w:proofErr w:type="gramEnd"/>
             <w:r>
@@ -7896,7 +7893,6 @@
             </w:pPr>
             <w:proofErr w:type="gramStart"/>
             <w:r>
-              <w:lastRenderedPageBreak/>
               <w:t xml:space="preserve">{{ </w:t>
             </w:r>
             <w:proofErr w:type="spellStart"/>
@@ -7917,11 +7913,7 @@
             </w:r>
             <w:proofErr w:type="spellStart"/>
             <w:r>
-              <w:t>holi</w:t>
-            </w:r>
-            <w:r>
-              <w:lastRenderedPageBreak/>
-              <w:t>day.holiday</w:t>
+              <w:t>holiday.holiday</w:t>
             </w:r>
             <w:proofErr w:type="gramEnd"/>
             <w:r>
@@ -7955,7 +7947,6 @@
               </w:rPr>
             </w:pPr>
             <w:r>
-              <w:lastRenderedPageBreak/>
               <w:t xml:space="preserve">{%tr </w:t>
             </w:r>
             <w:proofErr w:type="spellStart"/>
@@ -7982,7 +7973,7 @@
               </w:rPr>
             </w:pPr>
             <w:r>
-              <w:t xml:space="preserve">{%tr for holiday in </w:t>
+              <w:t>{%tr for holiday in (</w:t>
             </w:r>
             <w:proofErr w:type="spellStart"/>
             <w:r>
@@ -7990,7 +7981,23 @@
             </w:r>
             <w:proofErr w:type="spellEnd"/>
             <w:r>
-              <w:t xml:space="preserve"> %}</w:t>
+              <w:t xml:space="preserve"> if </w:t>
+            </w:r>
+            <w:proofErr w:type="spellStart"/>
+            <w:r>
+              <w:t>other_</w:t>
+            </w:r>
+            <w:proofErr w:type="gramStart"/>
+            <w:r>
+              <w:t>holidays.there</w:t>
+            </w:r>
+            <w:proofErr w:type="gramEnd"/>
+            <w:r>
+              <w:t>_are_any</w:t>
+            </w:r>
+            <w:proofErr w:type="spellEnd"/>
+            <w:r>
+              <w:t xml:space="preserve"> else []) %}</w:t>
             </w:r>
           </w:p>
         </w:tc>
@@ -8303,6 +8310,14 @@
           <w:rFonts w:ascii="Arial" w:hAnsi="Arial" w:cs="Arial"/>
         </w:rPr>
       </w:pPr>
+    </w:p>
+    <w:p>
+      <w:pPr>
+        <w:spacing w:after="0"/>
+        <w:rPr>
+          <w:rFonts w:ascii="Arial" w:hAnsi="Arial" w:cs="Arial"/>
+        </w:rPr>
+      </w:pPr>
       <w:r>
         <w:rPr>
           <w:rFonts w:ascii="Arial" w:hAnsi="Arial" w:cs="Arial"/>
@@ -8357,14 +8372,6 @@
         </w:rPr>
         <w:t xml:space="preserve"> %}</w:t>
       </w:r>
-    </w:p>
-    <w:p>
-      <w:pPr>
-        <w:spacing w:after="0"/>
-        <w:rPr>
-          <w:rFonts w:ascii="Arial" w:hAnsi="Arial" w:cs="Arial"/>
-        </w:rPr>
-      </w:pPr>
     </w:p>
     <w:p>
       <w:pPr>
@@ -8454,14 +8461,6 @@
           <w:rFonts w:ascii="Arial" w:hAnsi="Arial" w:cs="Arial"/>
         </w:rPr>
       </w:pPr>
-    </w:p>
-    <w:p>
-      <w:pPr>
-        <w:spacing w:after="0"/>
-        <w:rPr>
-          <w:rFonts w:ascii="Arial" w:hAnsi="Arial" w:cs="Arial"/>
-        </w:rPr>
-      </w:pPr>
       <w:r>
         <w:rPr>
           <w:rFonts w:ascii="Arial" w:hAnsi="Arial" w:cs="Arial"/>
@@ -8886,6 +8885,14 @@
           <w:rFonts w:ascii="Arial" w:hAnsi="Arial" w:cs="Arial"/>
         </w:rPr>
       </w:pPr>
+    </w:p>
+    <w:p>
+      <w:pPr>
+        <w:spacing w:after="0"/>
+        <w:rPr>
+          <w:rFonts w:ascii="Arial" w:hAnsi="Arial" w:cs="Arial"/>
+        </w:rPr>
+      </w:pPr>
       <w:r>
         <w:rPr>
           <w:rFonts w:ascii="Arial" w:hAnsi="Arial" w:cs="Arial"/>
@@ -8982,6 +8989,13 @@
           <w:rFonts w:ascii="Arial" w:hAnsi="Arial" w:cs="Arial"/>
         </w:rPr>
       </w:pPr>
+      <w:r>
+        <w:rPr>
+          <w:rFonts w:ascii="Arial" w:hAnsi="Arial" w:cs="Arial"/>
+        </w:rPr>
+        <w:lastRenderedPageBreak/>
+        <w:t>School Summer Break</w:t>
+      </w:r>
     </w:p>
     <w:p>
       <w:pPr>
@@ -8994,21 +9008,6 @@
         <w:rPr>
           <w:rFonts w:ascii="Arial" w:hAnsi="Arial" w:cs="Arial"/>
         </w:rPr>
-        <w:t>School Summer Break</w:t>
-      </w:r>
-    </w:p>
-    <w:p>
-      <w:pPr>
-        <w:spacing w:after="0"/>
-        <w:rPr>
-          <w:rFonts w:ascii="Arial" w:hAnsi="Arial" w:cs="Arial"/>
-        </w:rPr>
-      </w:pPr>
-      <w:r>
-        <w:rPr>
-          <w:rFonts w:ascii="Arial" w:hAnsi="Arial" w:cs="Arial"/>
-        </w:rPr>
-        <w:lastRenderedPageBreak/>
         <w:t>{%</w:t>
       </w:r>
       <w:r>
@@ -9415,6 +9414,14 @@
           <w:rFonts w:ascii="Arial" w:hAnsi="Arial" w:cs="Arial"/>
         </w:rPr>
       </w:pPr>
+    </w:p>
+    <w:p>
+      <w:pPr>
+        <w:spacing w:after="0"/>
+        <w:rPr>
+          <w:rFonts w:ascii="Arial" w:hAnsi="Arial" w:cs="Arial"/>
+        </w:rPr>
+      </w:pPr>
       <w:r>
         <w:rPr>
           <w:rFonts w:ascii="Arial" w:hAnsi="Arial" w:cs="Arial"/>
@@ -9511,14 +9518,6 @@
           <w:rFonts w:ascii="Arial" w:hAnsi="Arial" w:cs="Arial"/>
         </w:rPr>
       </w:pPr>
-    </w:p>
-    <w:p>
-      <w:pPr>
-        <w:spacing w:after="0"/>
-        <w:rPr>
-          <w:rFonts w:ascii="Arial" w:hAnsi="Arial" w:cs="Arial"/>
-        </w:rPr>
-      </w:pPr>
       <w:r>
         <w:rPr>
           <w:rFonts w:ascii="Arial" w:hAnsi="Arial" w:cs="Arial"/>
@@ -9991,6 +9990,14 @@
           <w:rFonts w:ascii="Arial" w:hAnsi="Arial" w:cs="Arial"/>
         </w:rPr>
       </w:pPr>
+    </w:p>
+    <w:p>
+      <w:pPr>
+        <w:spacing w:after="0"/>
+        <w:rPr>
+          <w:rFonts w:ascii="Arial" w:hAnsi="Arial" w:cs="Arial"/>
+        </w:rPr>
+      </w:pPr>
       <w:r>
         <w:rPr>
           <w:rFonts w:ascii="Arial" w:hAnsi="Arial" w:cs="Arial"/>
@@ -10037,819 +10044,6 @@
           <w:rFonts w:ascii="Arial" w:hAnsi="Arial" w:cs="Arial"/>
         </w:rPr>
         <w:t>transportation %}</w:t>
-      </w:r>
-      <w:proofErr w:type="gramEnd"/>
-    </w:p>
-    <w:p>
-      <w:pPr>
-        <w:spacing w:after="0"/>
-        <w:rPr>
-          <w:rFonts w:ascii="Arial" w:hAnsi="Arial" w:cs="Arial"/>
-        </w:rPr>
-      </w:pPr>
-    </w:p>
-    <w:p>
-      <w:pPr>
-        <w:pStyle w:val="ListParagraph"/>
-        <w:numPr>
-          <w:ilvl w:val="0"/>
-          <w:numId w:val="3"/>
-        </w:numPr>
-        <w:spacing w:after="0"/>
-        <w:rPr>
-          <w:rFonts w:ascii="Arial" w:hAnsi="Arial" w:cs="Arial"/>
-        </w:rPr>
-      </w:pPr>
-      <w:r>
-        <w:rPr>
-          <w:rFonts w:ascii="Arial" w:hAnsi="Arial" w:cs="Arial"/>
-        </w:rPr>
-        <w:t>TRANSPORTATION</w:t>
-      </w:r>
-    </w:p>
-    <w:p>
-      <w:pPr>
-        <w:spacing w:after="0"/>
-        <w:rPr>
-          <w:rFonts w:ascii="Arial" w:hAnsi="Arial" w:cs="Arial"/>
-        </w:rPr>
-      </w:pPr>
-      <w:r>
-        <w:rPr>
-          <w:rFonts w:ascii="Arial" w:hAnsi="Arial" w:cs="Arial"/>
-        </w:rPr>
-        <w:t xml:space="preserve">{% if transportation == 'me' </w:t>
-      </w:r>
-      <w:proofErr w:type="gramStart"/>
-      <w:r>
-        <w:rPr>
-          <w:rFonts w:ascii="Arial" w:hAnsi="Arial" w:cs="Arial"/>
-        </w:rPr>
-        <w:t>%}{{ users</w:t>
-      </w:r>
-      <w:proofErr w:type="gramEnd"/>
-      <w:r>
-        <w:rPr>
-          <w:rFonts w:ascii="Arial" w:hAnsi="Arial" w:cs="Arial"/>
-        </w:rPr>
-        <w:t>[0].</w:t>
-      </w:r>
-      <w:proofErr w:type="spellStart"/>
-      <w:r>
-        <w:rPr>
-          <w:rFonts w:ascii="Arial" w:hAnsi="Arial" w:cs="Arial"/>
-        </w:rPr>
-        <w:t>name_</w:t>
-      </w:r>
-      <w:proofErr w:type="gramStart"/>
-      <w:r>
-        <w:rPr>
-          <w:rFonts w:ascii="Arial" w:hAnsi="Arial" w:cs="Arial"/>
-        </w:rPr>
-        <w:t>full</w:t>
-      </w:r>
-      <w:proofErr w:type="spellEnd"/>
-      <w:r>
-        <w:rPr>
-          <w:rFonts w:ascii="Arial" w:hAnsi="Arial" w:cs="Arial"/>
-        </w:rPr>
-        <w:t>() }</w:t>
-      </w:r>
-      <w:proofErr w:type="gramEnd"/>
-      <w:r>
-        <w:rPr>
-          <w:rFonts w:ascii="Arial" w:hAnsi="Arial" w:cs="Arial"/>
-        </w:rPr>
-        <w:t xml:space="preserve">} will provide all </w:t>
-      </w:r>
-      <w:proofErr w:type="gramStart"/>
-      <w:r>
-        <w:rPr>
-          <w:rFonts w:ascii="Arial" w:hAnsi="Arial" w:cs="Arial"/>
-        </w:rPr>
-        <w:t>transportation.{</w:t>
-      </w:r>
-      <w:proofErr w:type="gramEnd"/>
-      <w:r>
-        <w:rPr>
-          <w:rFonts w:ascii="Arial" w:hAnsi="Arial" w:cs="Arial"/>
-        </w:rPr>
-        <w:t xml:space="preserve">% </w:t>
-      </w:r>
-      <w:proofErr w:type="spellStart"/>
-      <w:r>
-        <w:rPr>
-          <w:rFonts w:ascii="Arial" w:hAnsi="Arial" w:cs="Arial"/>
-        </w:rPr>
-        <w:t>elif</w:t>
-      </w:r>
-      <w:proofErr w:type="spellEnd"/>
-      <w:r>
-        <w:rPr>
-          <w:rFonts w:ascii="Arial" w:hAnsi="Arial" w:cs="Arial"/>
-        </w:rPr>
-        <w:t xml:space="preserve"> transportation == 'them' </w:t>
-      </w:r>
-      <w:proofErr w:type="gramStart"/>
-      <w:r>
-        <w:rPr>
-          <w:rFonts w:ascii="Arial" w:hAnsi="Arial" w:cs="Arial"/>
-        </w:rPr>
-        <w:t xml:space="preserve">%}{{ </w:t>
-      </w:r>
-      <w:proofErr w:type="spellStart"/>
-      <w:r>
-        <w:rPr>
-          <w:rFonts w:ascii="Arial" w:hAnsi="Arial" w:cs="Arial"/>
-        </w:rPr>
-        <w:t>other</w:t>
-      </w:r>
-      <w:proofErr w:type="gramEnd"/>
-      <w:r>
-        <w:rPr>
-          <w:rFonts w:ascii="Arial" w:hAnsi="Arial" w:cs="Arial"/>
-        </w:rPr>
-        <w:t>_parties</w:t>
-      </w:r>
-      <w:proofErr w:type="spellEnd"/>
-      <w:r>
-        <w:rPr>
-          <w:rFonts w:ascii="Arial" w:hAnsi="Arial" w:cs="Arial"/>
-        </w:rPr>
-        <w:t>[0].</w:t>
-      </w:r>
-      <w:proofErr w:type="spellStart"/>
-      <w:r>
-        <w:rPr>
-          <w:rFonts w:ascii="Arial" w:hAnsi="Arial" w:cs="Arial"/>
-        </w:rPr>
-        <w:t>name_</w:t>
-      </w:r>
-      <w:proofErr w:type="gramStart"/>
-      <w:r>
-        <w:rPr>
-          <w:rFonts w:ascii="Arial" w:hAnsi="Arial" w:cs="Arial"/>
-        </w:rPr>
-        <w:t>full</w:t>
-      </w:r>
-      <w:proofErr w:type="spellEnd"/>
-      <w:r>
-        <w:rPr>
-          <w:rFonts w:ascii="Arial" w:hAnsi="Arial" w:cs="Arial"/>
-        </w:rPr>
-        <w:t>() }</w:t>
-      </w:r>
-      <w:proofErr w:type="gramEnd"/>
-      <w:r>
-        <w:rPr>
-          <w:rFonts w:ascii="Arial" w:hAnsi="Arial" w:cs="Arial"/>
-        </w:rPr>
-        <w:t xml:space="preserve">} will provide all </w:t>
-      </w:r>
-      <w:proofErr w:type="gramStart"/>
-      <w:r>
-        <w:rPr>
-          <w:rFonts w:ascii="Arial" w:hAnsi="Arial" w:cs="Arial"/>
-        </w:rPr>
-        <w:t>transportation.</w:t>
-      </w:r>
-      <w:r>
-        <w:rPr>
-          <w:rFonts w:ascii="Arial" w:hAnsi="Arial" w:cs="Arial"/>
-        </w:rPr>
-        <w:t>{</w:t>
-      </w:r>
-      <w:proofErr w:type="gramEnd"/>
-      <w:r>
-        <w:rPr>
-          <w:rFonts w:ascii="Arial" w:hAnsi="Arial" w:cs="Arial"/>
-        </w:rPr>
-        <w:t xml:space="preserve">% </w:t>
-      </w:r>
-      <w:proofErr w:type="spellStart"/>
-      <w:r>
-        <w:rPr>
-          <w:rFonts w:ascii="Arial" w:hAnsi="Arial" w:cs="Arial"/>
-        </w:rPr>
-        <w:t>elif</w:t>
-      </w:r>
-      <w:proofErr w:type="spellEnd"/>
-      <w:r>
-        <w:rPr>
-          <w:rFonts w:ascii="Arial" w:hAnsi="Arial" w:cs="Arial"/>
-        </w:rPr>
-        <w:t xml:space="preserve"> transportation == '</w:t>
-      </w:r>
-      <w:proofErr w:type="spellStart"/>
-      <w:r>
-        <w:rPr>
-          <w:rFonts w:ascii="Arial" w:hAnsi="Arial" w:cs="Arial"/>
-        </w:rPr>
-        <w:t>pick_up</w:t>
-      </w:r>
-      <w:proofErr w:type="spellEnd"/>
-      <w:r>
-        <w:rPr>
-          <w:rFonts w:ascii="Arial" w:hAnsi="Arial" w:cs="Arial"/>
-        </w:rPr>
-        <w:t xml:space="preserve">' </w:t>
-      </w:r>
-      <w:proofErr w:type="gramStart"/>
-      <w:r>
-        <w:rPr>
-          <w:rFonts w:ascii="Arial" w:hAnsi="Arial" w:cs="Arial"/>
-        </w:rPr>
-        <w:t>%}Each</w:t>
-      </w:r>
-      <w:proofErr w:type="gramEnd"/>
-      <w:r>
-        <w:rPr>
-          <w:rFonts w:ascii="Arial" w:hAnsi="Arial" w:cs="Arial"/>
-        </w:rPr>
-        <w:t xml:space="preserve"> parent will pick up the {% if children | length &gt; 1 </w:t>
-      </w:r>
-      <w:proofErr w:type="gramStart"/>
-      <w:r>
-        <w:rPr>
-          <w:rFonts w:ascii="Arial" w:hAnsi="Arial" w:cs="Arial"/>
-        </w:rPr>
-        <w:t>%}children</w:t>
-      </w:r>
-      <w:proofErr w:type="gramEnd"/>
-      <w:r>
-        <w:rPr>
-          <w:rFonts w:ascii="Arial" w:hAnsi="Arial" w:cs="Arial"/>
-        </w:rPr>
-        <w:t xml:space="preserve">{% else </w:t>
-      </w:r>
-      <w:proofErr w:type="gramStart"/>
-      <w:r>
-        <w:rPr>
-          <w:rFonts w:ascii="Arial" w:hAnsi="Arial" w:cs="Arial"/>
-        </w:rPr>
-        <w:t>%}child</w:t>
-      </w:r>
-      <w:proofErr w:type="gramEnd"/>
-      <w:r>
-        <w:rPr>
-          <w:rFonts w:ascii="Arial" w:hAnsi="Arial" w:cs="Arial"/>
-        </w:rPr>
-        <w:t xml:space="preserve">{% endif %} at the start of their parenting time. {% </w:t>
-      </w:r>
-      <w:proofErr w:type="spellStart"/>
-      <w:r>
-        <w:rPr>
-          <w:rFonts w:ascii="Arial" w:hAnsi="Arial" w:cs="Arial"/>
-        </w:rPr>
-        <w:t>elif</w:t>
-      </w:r>
-      <w:proofErr w:type="spellEnd"/>
-      <w:r>
-        <w:rPr>
-          <w:rFonts w:ascii="Arial" w:hAnsi="Arial" w:cs="Arial"/>
-        </w:rPr>
-        <w:t xml:space="preserve"> transportation == '</w:t>
-      </w:r>
-      <w:proofErr w:type="spellStart"/>
-      <w:r>
-        <w:rPr>
-          <w:rFonts w:ascii="Arial" w:hAnsi="Arial" w:cs="Arial"/>
-        </w:rPr>
-        <w:t>drop_off</w:t>
-      </w:r>
-      <w:proofErr w:type="spellEnd"/>
-      <w:r>
-        <w:rPr>
-          <w:rFonts w:ascii="Arial" w:hAnsi="Arial" w:cs="Arial"/>
-        </w:rPr>
-        <w:t xml:space="preserve">' </w:t>
-      </w:r>
-      <w:proofErr w:type="gramStart"/>
-      <w:r>
-        <w:rPr>
-          <w:rFonts w:ascii="Arial" w:hAnsi="Arial" w:cs="Arial"/>
-        </w:rPr>
-        <w:t>%}Each</w:t>
-      </w:r>
-      <w:proofErr w:type="gramEnd"/>
-      <w:r>
-        <w:rPr>
-          <w:rFonts w:ascii="Arial" w:hAnsi="Arial" w:cs="Arial"/>
-        </w:rPr>
-        <w:t xml:space="preserve"> parent will drop off the {% if children | length &gt; 1 </w:t>
-      </w:r>
-      <w:proofErr w:type="gramStart"/>
-      <w:r>
-        <w:rPr>
-          <w:rFonts w:ascii="Arial" w:hAnsi="Arial" w:cs="Arial"/>
-        </w:rPr>
-        <w:t>%}children</w:t>
-      </w:r>
-      <w:proofErr w:type="gramEnd"/>
-      <w:r>
-        <w:rPr>
-          <w:rFonts w:ascii="Arial" w:hAnsi="Arial" w:cs="Arial"/>
-        </w:rPr>
-        <w:t xml:space="preserve">{% else </w:t>
-      </w:r>
-      <w:proofErr w:type="gramStart"/>
-      <w:r>
-        <w:rPr>
-          <w:rFonts w:ascii="Arial" w:hAnsi="Arial" w:cs="Arial"/>
-        </w:rPr>
-        <w:t>%}child</w:t>
-      </w:r>
-      <w:proofErr w:type="gramEnd"/>
-      <w:r>
-        <w:rPr>
-          <w:rFonts w:ascii="Arial" w:hAnsi="Arial" w:cs="Arial"/>
-        </w:rPr>
-        <w:t xml:space="preserve">{% endif %} at the end of their parenting </w:t>
-      </w:r>
-      <w:proofErr w:type="gramStart"/>
-      <w:r>
-        <w:rPr>
-          <w:rFonts w:ascii="Arial" w:hAnsi="Arial" w:cs="Arial"/>
-        </w:rPr>
-        <w:t>time.{</w:t>
-      </w:r>
-      <w:proofErr w:type="gramEnd"/>
-      <w:r>
-        <w:rPr>
-          <w:rFonts w:ascii="Arial" w:hAnsi="Arial" w:cs="Arial"/>
-        </w:rPr>
-        <w:t xml:space="preserve">% </w:t>
-      </w:r>
-      <w:proofErr w:type="spellStart"/>
-      <w:r>
-        <w:rPr>
-          <w:rFonts w:ascii="Arial" w:hAnsi="Arial" w:cs="Arial"/>
-        </w:rPr>
-        <w:t>elif</w:t>
-      </w:r>
-      <w:proofErr w:type="spellEnd"/>
-      <w:r>
-        <w:rPr>
-          <w:rFonts w:ascii="Arial" w:hAnsi="Arial" w:cs="Arial"/>
-        </w:rPr>
-        <w:t xml:space="preserve"> transportation == 'other' </w:t>
-      </w:r>
-      <w:proofErr w:type="gramStart"/>
-      <w:r>
-        <w:rPr>
-          <w:rFonts w:ascii="Arial" w:hAnsi="Arial" w:cs="Arial"/>
-        </w:rPr>
-        <w:t>%}Other</w:t>
-      </w:r>
-      <w:proofErr w:type="gramEnd"/>
-      <w:r>
-        <w:rPr>
-          <w:rFonts w:ascii="Arial" w:hAnsi="Arial" w:cs="Arial"/>
-        </w:rPr>
-        <w:t xml:space="preserve">: </w:t>
-      </w:r>
-      <w:proofErr w:type="gramStart"/>
-      <w:r>
-        <w:rPr>
-          <w:rFonts w:ascii="Arial" w:hAnsi="Arial" w:cs="Arial"/>
-        </w:rPr>
-        <w:t xml:space="preserve">{{ </w:t>
-      </w:r>
-      <w:proofErr w:type="spellStart"/>
-      <w:r>
-        <w:rPr>
-          <w:rFonts w:ascii="Arial" w:hAnsi="Arial" w:cs="Arial"/>
-        </w:rPr>
-        <w:t>transportation</w:t>
-      </w:r>
-      <w:proofErr w:type="gramEnd"/>
-      <w:r>
-        <w:rPr>
-          <w:rFonts w:ascii="Arial" w:hAnsi="Arial" w:cs="Arial"/>
-        </w:rPr>
-        <w:t>_</w:t>
-      </w:r>
-      <w:proofErr w:type="gramStart"/>
-      <w:r>
-        <w:rPr>
-          <w:rFonts w:ascii="Arial" w:hAnsi="Arial" w:cs="Arial"/>
-        </w:rPr>
-        <w:t>other</w:t>
-      </w:r>
-      <w:proofErr w:type="spellEnd"/>
-      <w:r>
-        <w:rPr>
-          <w:rFonts w:ascii="Arial" w:hAnsi="Arial" w:cs="Arial"/>
-        </w:rPr>
-        <w:t xml:space="preserve"> }}{</w:t>
-      </w:r>
-      <w:proofErr w:type="gramEnd"/>
-      <w:r>
-        <w:rPr>
-          <w:rFonts w:ascii="Arial" w:hAnsi="Arial" w:cs="Arial"/>
-        </w:rPr>
-        <w:t>% endif %}</w:t>
-      </w:r>
-    </w:p>
-    <w:p>
-      <w:pPr>
-        <w:spacing w:after="0"/>
-        <w:rPr>
-          <w:rFonts w:ascii="Arial" w:hAnsi="Arial" w:cs="Arial"/>
-        </w:rPr>
-      </w:pPr>
-      <w:r>
-        <w:rPr>
-          <w:rFonts w:ascii="Arial" w:hAnsi="Arial" w:cs="Arial"/>
-        </w:rPr>
-        <w:t>{%</w:t>
-      </w:r>
-      <w:r>
-        <w:rPr>
-          <w:rFonts w:ascii="Arial" w:hAnsi="Arial" w:cs="Arial"/>
-        </w:rPr>
-        <w:t>p</w:t>
-      </w:r>
-      <w:r>
-        <w:rPr>
-          <w:rFonts w:ascii="Arial" w:hAnsi="Arial" w:cs="Arial"/>
-        </w:rPr>
-        <w:t xml:space="preserve"> </w:t>
-      </w:r>
-      <w:proofErr w:type="gramStart"/>
-      <w:r>
-        <w:rPr>
-          <w:rFonts w:ascii="Arial" w:hAnsi="Arial" w:cs="Arial"/>
-        </w:rPr>
-        <w:t>endif %}</w:t>
-      </w:r>
-      <w:proofErr w:type="gramEnd"/>
-    </w:p>
-    <w:p>
-      <w:pPr>
-        <w:spacing w:after="0"/>
-        <w:rPr>
-          <w:rFonts w:ascii="Arial" w:hAnsi="Arial" w:cs="Arial"/>
-        </w:rPr>
-      </w:pPr>
-      <w:r>
-        <w:rPr>
-          <w:rFonts w:ascii="Arial" w:hAnsi="Arial" w:cs="Arial"/>
-        </w:rPr>
-        <w:t>{</w:t>
-      </w:r>
-      <w:r>
-        <w:rPr>
-          <w:rFonts w:ascii="Arial" w:hAnsi="Arial" w:cs="Arial"/>
-        </w:rPr>
-        <w:t xml:space="preserve">%p </w:t>
-      </w:r>
-      <w:r>
-        <w:rPr>
-          <w:rFonts w:ascii="Arial" w:hAnsi="Arial" w:cs="Arial"/>
-        </w:rPr>
-        <w:t xml:space="preserve">if </w:t>
-      </w:r>
-      <w:proofErr w:type="spellStart"/>
-      <w:r>
-        <w:rPr>
-          <w:rFonts w:ascii="Arial" w:hAnsi="Arial" w:cs="Arial"/>
-        </w:rPr>
-        <w:t>exchange_</w:t>
-      </w:r>
-      <w:proofErr w:type="gramStart"/>
-      <w:r>
-        <w:rPr>
-          <w:rFonts w:ascii="Arial" w:hAnsi="Arial" w:cs="Arial"/>
-        </w:rPr>
-        <w:t>location</w:t>
-      </w:r>
-      <w:proofErr w:type="spellEnd"/>
-      <w:r>
-        <w:rPr>
-          <w:rFonts w:ascii="Arial" w:hAnsi="Arial" w:cs="Arial"/>
-        </w:rPr>
-        <w:t xml:space="preserve"> %</w:t>
-      </w:r>
-      <w:r>
-        <w:rPr>
-          <w:rFonts w:ascii="Arial" w:hAnsi="Arial" w:cs="Arial"/>
-        </w:rPr>
-        <w:t>}</w:t>
-      </w:r>
-      <w:proofErr w:type="gramEnd"/>
-    </w:p>
-    <w:p>
-      <w:pPr>
-        <w:spacing w:after="0"/>
-        <w:rPr>
-          <w:rFonts w:ascii="Arial" w:hAnsi="Arial" w:cs="Arial"/>
-        </w:rPr>
-      </w:pPr>
-    </w:p>
-    <w:p>
-      <w:pPr>
-        <w:pStyle w:val="ListParagraph"/>
-        <w:numPr>
-          <w:ilvl w:val="0"/>
-          <w:numId w:val="3"/>
-        </w:numPr>
-        <w:spacing w:after="0"/>
-        <w:rPr>
-          <w:rFonts w:ascii="Arial" w:hAnsi="Arial" w:cs="Arial"/>
-        </w:rPr>
-      </w:pPr>
-      <w:r>
-        <w:rPr>
-          <w:rFonts w:ascii="Arial" w:hAnsi="Arial" w:cs="Arial"/>
-        </w:rPr>
-        <w:lastRenderedPageBreak/>
-        <w:t>EXCHANGE OF CHILDREN</w:t>
-      </w:r>
-    </w:p>
-    <w:p>
-      <w:pPr>
-        <w:spacing w:after="0"/>
-        <w:rPr>
-          <w:rFonts w:ascii="Arial" w:hAnsi="Arial" w:cs="Arial"/>
-        </w:rPr>
-      </w:pPr>
-      <w:r>
-        <w:rPr>
-          <w:rFonts w:ascii="Arial" w:hAnsi="Arial" w:cs="Arial"/>
-        </w:rPr>
-        <w:t xml:space="preserve">{% if </w:t>
-      </w:r>
-      <w:proofErr w:type="spellStart"/>
-      <w:r>
-        <w:rPr>
-          <w:rFonts w:ascii="Arial" w:hAnsi="Arial" w:cs="Arial"/>
-        </w:rPr>
-        <w:t>exchange_location</w:t>
-      </w:r>
-      <w:proofErr w:type="spellEnd"/>
-      <w:r>
-        <w:rPr>
-          <w:rFonts w:ascii="Arial" w:hAnsi="Arial" w:cs="Arial"/>
-        </w:rPr>
-        <w:t xml:space="preserve"> == 'homes' </w:t>
-      </w:r>
-      <w:proofErr w:type="gramStart"/>
-      <w:r>
-        <w:rPr>
-          <w:rFonts w:ascii="Arial" w:hAnsi="Arial" w:cs="Arial"/>
-        </w:rPr>
-        <w:t>%}Drop</w:t>
-      </w:r>
-      <w:proofErr w:type="gramEnd"/>
-      <w:r>
-        <w:rPr>
-          <w:rFonts w:ascii="Arial" w:hAnsi="Arial" w:cs="Arial"/>
-        </w:rPr>
-        <w:t xml:space="preserve"> off and pick up of the children will be at each parent's home unless both parties agree in advance to a different meeting </w:t>
-      </w:r>
-      <w:proofErr w:type="gramStart"/>
-      <w:r>
-        <w:rPr>
-          <w:rFonts w:ascii="Arial" w:hAnsi="Arial" w:cs="Arial"/>
-        </w:rPr>
-        <w:t>place.{</w:t>
-      </w:r>
-      <w:proofErr w:type="gramEnd"/>
-      <w:r>
-        <w:rPr>
-          <w:rFonts w:ascii="Arial" w:hAnsi="Arial" w:cs="Arial"/>
-        </w:rPr>
-        <w:t xml:space="preserve">% </w:t>
-      </w:r>
-      <w:proofErr w:type="spellStart"/>
-      <w:r>
-        <w:rPr>
-          <w:rFonts w:ascii="Arial" w:hAnsi="Arial" w:cs="Arial"/>
-        </w:rPr>
-        <w:t>elif</w:t>
-      </w:r>
-      <w:proofErr w:type="spellEnd"/>
-      <w:r>
-        <w:rPr>
-          <w:rFonts w:ascii="Arial" w:hAnsi="Arial" w:cs="Arial"/>
-        </w:rPr>
-        <w:t xml:space="preserve"> </w:t>
-      </w:r>
-      <w:proofErr w:type="spellStart"/>
-      <w:r>
-        <w:rPr>
-          <w:rFonts w:ascii="Arial" w:hAnsi="Arial" w:cs="Arial"/>
-        </w:rPr>
-        <w:t>exchange_location</w:t>
-      </w:r>
-      <w:proofErr w:type="spellEnd"/>
-      <w:r>
-        <w:rPr>
-          <w:rFonts w:ascii="Arial" w:hAnsi="Arial" w:cs="Arial"/>
-        </w:rPr>
-        <w:t xml:space="preserve"> == 'location' </w:t>
-      </w:r>
-      <w:proofErr w:type="gramStart"/>
-      <w:r>
-        <w:rPr>
-          <w:rFonts w:ascii="Arial" w:hAnsi="Arial" w:cs="Arial"/>
-        </w:rPr>
-        <w:t>%}Drop</w:t>
-      </w:r>
-      <w:proofErr w:type="gramEnd"/>
-      <w:r>
-        <w:rPr>
-          <w:rFonts w:ascii="Arial" w:hAnsi="Arial" w:cs="Arial"/>
-        </w:rPr>
-        <w:t xml:space="preserve"> off and pick up will take place at </w:t>
-      </w:r>
-      <w:proofErr w:type="gramStart"/>
-      <w:r>
-        <w:rPr>
-          <w:rFonts w:ascii="Arial" w:hAnsi="Arial" w:cs="Arial"/>
-        </w:rPr>
-        <w:t xml:space="preserve">{{ </w:t>
-      </w:r>
-      <w:proofErr w:type="spellStart"/>
-      <w:r>
-        <w:rPr>
-          <w:rFonts w:ascii="Arial" w:hAnsi="Arial" w:cs="Arial"/>
-        </w:rPr>
-        <w:t>exchange</w:t>
-      </w:r>
-      <w:proofErr w:type="gramEnd"/>
-      <w:r>
-        <w:rPr>
-          <w:rFonts w:ascii="Arial" w:hAnsi="Arial" w:cs="Arial"/>
-        </w:rPr>
-        <w:t>_</w:t>
-      </w:r>
-      <w:proofErr w:type="gramStart"/>
-      <w:r>
-        <w:rPr>
-          <w:rFonts w:ascii="Arial" w:hAnsi="Arial" w:cs="Arial"/>
-        </w:rPr>
-        <w:t>address.location</w:t>
-      </w:r>
-      <w:proofErr w:type="spellEnd"/>
-      <w:proofErr w:type="gramEnd"/>
-      <w:r>
-        <w:rPr>
-          <w:rFonts w:ascii="Arial" w:hAnsi="Arial" w:cs="Arial"/>
-        </w:rPr>
-        <w:t xml:space="preserve"> }}, </w:t>
-      </w:r>
-      <w:proofErr w:type="gramStart"/>
-      <w:r>
-        <w:rPr>
-          <w:rFonts w:ascii="Arial" w:hAnsi="Arial" w:cs="Arial"/>
-        </w:rPr>
-        <w:t xml:space="preserve">{{ </w:t>
-      </w:r>
-      <w:proofErr w:type="spellStart"/>
-      <w:r>
-        <w:rPr>
-          <w:rFonts w:ascii="Arial" w:hAnsi="Arial" w:cs="Arial"/>
-        </w:rPr>
-        <w:t>exchange</w:t>
-      </w:r>
-      <w:proofErr w:type="gramEnd"/>
-      <w:r>
-        <w:rPr>
-          <w:rFonts w:ascii="Arial" w:hAnsi="Arial" w:cs="Arial"/>
-        </w:rPr>
-        <w:t>_</w:t>
-      </w:r>
-      <w:proofErr w:type="gramStart"/>
-      <w:r>
-        <w:rPr>
-          <w:rFonts w:ascii="Arial" w:hAnsi="Arial" w:cs="Arial"/>
-        </w:rPr>
-        <w:t>address.address</w:t>
-      </w:r>
-      <w:proofErr w:type="gramEnd"/>
-      <w:r>
-        <w:rPr>
-          <w:rFonts w:ascii="Arial" w:hAnsi="Arial" w:cs="Arial"/>
-        </w:rPr>
-        <w:t>.on_one_line</w:t>
-      </w:r>
-      <w:proofErr w:type="spellEnd"/>
-      <w:r>
-        <w:rPr>
-          <w:rFonts w:ascii="Arial" w:hAnsi="Arial" w:cs="Arial"/>
-        </w:rPr>
-        <w:t>(bare=True</w:t>
-      </w:r>
-      <w:proofErr w:type="gramStart"/>
-      <w:r>
-        <w:rPr>
-          <w:rFonts w:ascii="Arial" w:hAnsi="Arial" w:cs="Arial"/>
-        </w:rPr>
-        <w:t>) }</w:t>
-      </w:r>
-      <w:proofErr w:type="gramEnd"/>
-      <w:r>
-        <w:rPr>
-          <w:rFonts w:ascii="Arial" w:hAnsi="Arial" w:cs="Arial"/>
-        </w:rPr>
-        <w:t>}.</w:t>
-      </w:r>
-      <w:r>
-        <w:rPr>
-          <w:rFonts w:ascii="Arial" w:hAnsi="Arial" w:cs="Arial"/>
-        </w:rPr>
-        <w:t>{% endif %}</w:t>
-      </w:r>
-    </w:p>
-    <w:p>
-      <w:pPr>
-        <w:spacing w:after="0"/>
-        <w:rPr>
-          <w:rFonts w:ascii="Arial" w:hAnsi="Arial" w:cs="Arial"/>
-        </w:rPr>
-      </w:pPr>
-      <w:r>
-        <w:rPr>
-          <w:rFonts w:ascii="Arial" w:hAnsi="Arial" w:cs="Arial"/>
-        </w:rPr>
-        <w:t>{%</w:t>
-      </w:r>
-      <w:r>
-        <w:rPr>
-          <w:rFonts w:ascii="Arial" w:hAnsi="Arial" w:cs="Arial"/>
-        </w:rPr>
-        <w:t>p</w:t>
-      </w:r>
-      <w:r>
-        <w:rPr>
-          <w:rFonts w:ascii="Arial" w:hAnsi="Arial" w:cs="Arial"/>
-        </w:rPr>
-        <w:t xml:space="preserve"> </w:t>
-      </w:r>
-      <w:proofErr w:type="gramStart"/>
-      <w:r>
-        <w:rPr>
-          <w:rFonts w:ascii="Arial" w:hAnsi="Arial" w:cs="Arial"/>
-        </w:rPr>
-        <w:t>endif %}</w:t>
-      </w:r>
-      <w:proofErr w:type="gramEnd"/>
-    </w:p>
-    <w:p>
-      <w:pPr>
-        <w:spacing w:after="0"/>
-        <w:rPr>
-          <w:rFonts w:ascii="Arial" w:hAnsi="Arial" w:cs="Arial"/>
-        </w:rPr>
-      </w:pPr>
-    </w:p>
-    <w:p>
-      <w:pPr>
-        <w:spacing w:after="0"/>
-        <w:rPr>
-          <w:rFonts w:ascii="Arial" w:hAnsi="Arial" w:cs="Arial"/>
-        </w:rPr>
-      </w:pPr>
-      <w:r>
-        <w:rPr>
-          <w:rFonts w:ascii="Arial" w:hAnsi="Arial" w:cs="Arial"/>
-        </w:rPr>
-        <w:t>{%</w:t>
-      </w:r>
-      <w:r>
-        <w:rPr>
-          <w:rFonts w:ascii="Arial" w:hAnsi="Arial" w:cs="Arial"/>
-        </w:rPr>
-        <w:t>p</w:t>
-      </w:r>
-      <w:r>
-        <w:rPr>
-          <w:rFonts w:ascii="Arial" w:hAnsi="Arial" w:cs="Arial"/>
-        </w:rPr>
-        <w:t xml:space="preserve"> if </w:t>
-      </w:r>
-      <w:proofErr w:type="spellStart"/>
-      <w:r>
-        <w:rPr>
-          <w:rFonts w:ascii="Arial" w:hAnsi="Arial" w:cs="Arial"/>
-        </w:rPr>
-        <w:t>additional_</w:t>
-      </w:r>
-      <w:proofErr w:type="gramStart"/>
-      <w:r>
-        <w:rPr>
-          <w:rFonts w:ascii="Arial" w:hAnsi="Arial" w:cs="Arial"/>
-        </w:rPr>
-        <w:t>time</w:t>
-      </w:r>
-      <w:proofErr w:type="spellEnd"/>
-      <w:r>
-        <w:rPr>
-          <w:rFonts w:ascii="Arial" w:hAnsi="Arial" w:cs="Arial"/>
-        </w:rPr>
-        <w:t xml:space="preserve"> %}</w:t>
       </w:r>
       <w:proofErr w:type="gramEnd"/>
     </w:p>
@@ -10869,7 +10063,7 @@
         <w:rPr>
           <w:rFonts w:ascii="Arial" w:hAnsi="Arial" w:cs="Arial"/>
         </w:rPr>
-        <w:t>ADDITIONAL INFORMATION</w:t>
+        <w:t>TRANSPORTATION</w:t>
       </w:r>
     </w:p>
     <w:p>
@@ -10879,68 +10073,342 @@
           <w:rFonts w:ascii="Arial" w:hAnsi="Arial" w:cs="Arial"/>
         </w:rPr>
       </w:pPr>
+      <w:r>
+        <w:rPr>
+          <w:rFonts w:ascii="Arial" w:hAnsi="Arial" w:cs="Arial"/>
+        </w:rPr>
+        <w:t xml:space="preserve">{% if transportation == 'me' </w:t>
+      </w:r>
       <w:proofErr w:type="gramStart"/>
       <w:r>
         <w:rPr>
           <w:rFonts w:ascii="Arial" w:hAnsi="Arial" w:cs="Arial"/>
         </w:rPr>
-        <w:t xml:space="preserve">{{ </w:t>
+        <w:t>%}{{ users</w:t>
+      </w:r>
+      <w:proofErr w:type="gramEnd"/>
+      <w:r>
+        <w:rPr>
+          <w:rFonts w:ascii="Arial" w:hAnsi="Arial" w:cs="Arial"/>
+        </w:rPr>
+        <w:t>[0].</w:t>
       </w:r>
       <w:proofErr w:type="spellStart"/>
       <w:r>
         <w:rPr>
           <w:rFonts w:ascii="Arial" w:hAnsi="Arial" w:cs="Arial"/>
         </w:rPr>
-        <w:t>additional</w:t>
+        <w:t>name_</w:t>
+      </w:r>
+      <w:proofErr w:type="gramStart"/>
+      <w:r>
+        <w:rPr>
+          <w:rFonts w:ascii="Arial" w:hAnsi="Arial" w:cs="Arial"/>
+        </w:rPr>
+        <w:t>full</w:t>
+      </w:r>
+      <w:proofErr w:type="spellEnd"/>
+      <w:r>
+        <w:rPr>
+          <w:rFonts w:ascii="Arial" w:hAnsi="Arial" w:cs="Arial"/>
+        </w:rPr>
+        <w:t>() }</w:t>
       </w:r>
       <w:proofErr w:type="gramEnd"/>
       <w:r>
         <w:rPr>
           <w:rFonts w:ascii="Arial" w:hAnsi="Arial" w:cs="Arial"/>
         </w:rPr>
-        <w:t>_time_</w:t>
+        <w:t xml:space="preserve">} will provide all </w:t>
       </w:r>
       <w:proofErr w:type="gramStart"/>
       <w:r>
         <w:rPr>
           <w:rFonts w:ascii="Arial" w:hAnsi="Arial" w:cs="Arial"/>
         </w:rPr>
-        <w:t>details</w:t>
+        <w:t>transportation.{</w:t>
+      </w:r>
+      <w:proofErr w:type="gramEnd"/>
+      <w:r>
+        <w:rPr>
+          <w:rFonts w:ascii="Arial" w:hAnsi="Arial" w:cs="Arial"/>
+        </w:rPr>
+        <w:t xml:space="preserve">% </w:t>
+      </w:r>
+      <w:proofErr w:type="spellStart"/>
+      <w:r>
+        <w:rPr>
+          <w:rFonts w:ascii="Arial" w:hAnsi="Arial" w:cs="Arial"/>
+        </w:rPr>
+        <w:t>elif</w:t>
       </w:r>
       <w:proofErr w:type="spellEnd"/>
       <w:r>
         <w:rPr>
           <w:rFonts w:ascii="Arial" w:hAnsi="Arial" w:cs="Arial"/>
         </w:rPr>
-        <w:t xml:space="preserve"> }</w:t>
+        <w:t xml:space="preserve"> transportation == 'them' </w:t>
+      </w:r>
+      <w:proofErr w:type="gramStart"/>
+      <w:r>
+        <w:rPr>
+          <w:rFonts w:ascii="Arial" w:hAnsi="Arial" w:cs="Arial"/>
+        </w:rPr>
+        <w:t xml:space="preserve">%}{{ </w:t>
+      </w:r>
+      <w:proofErr w:type="spellStart"/>
+      <w:r>
+        <w:rPr>
+          <w:rFonts w:ascii="Arial" w:hAnsi="Arial" w:cs="Arial"/>
+        </w:rPr>
+        <w:t>other</w:t>
       </w:r>
       <w:proofErr w:type="gramEnd"/>
       <w:r>
         <w:rPr>
           <w:rFonts w:ascii="Arial" w:hAnsi="Arial" w:cs="Arial"/>
         </w:rPr>
-        <w:t>}</w:t>
-      </w:r>
-    </w:p>
-    <w:p>
-      <w:pPr>
-        <w:spacing w:after="0"/>
-        <w:rPr>
-          <w:rFonts w:ascii="Arial" w:hAnsi="Arial" w:cs="Arial"/>
-        </w:rPr>
-      </w:pPr>
-      <w:r>
-        <w:rPr>
-          <w:rFonts w:ascii="Arial" w:hAnsi="Arial" w:cs="Arial"/>
-        </w:rPr>
-        <w:t>{%</w:t>
-      </w:r>
-      <w:r>
-        <w:rPr>
-          <w:rFonts w:ascii="Arial" w:hAnsi="Arial" w:cs="Arial"/>
-        </w:rPr>
-        <w:t>p</w:t>
-      </w:r>
+        <w:t>_parties</w:t>
+      </w:r>
+      <w:proofErr w:type="spellEnd"/>
+      <w:r>
+        <w:rPr>
+          <w:rFonts w:ascii="Arial" w:hAnsi="Arial" w:cs="Arial"/>
+        </w:rPr>
+        <w:t>[0].</w:t>
+      </w:r>
+      <w:proofErr w:type="spellStart"/>
+      <w:r>
+        <w:rPr>
+          <w:rFonts w:ascii="Arial" w:hAnsi="Arial" w:cs="Arial"/>
+        </w:rPr>
+        <w:t>name_</w:t>
+      </w:r>
+      <w:proofErr w:type="gramStart"/>
+      <w:r>
+        <w:rPr>
+          <w:rFonts w:ascii="Arial" w:hAnsi="Arial" w:cs="Arial"/>
+        </w:rPr>
+        <w:t>full</w:t>
+      </w:r>
+      <w:proofErr w:type="spellEnd"/>
+      <w:r>
+        <w:rPr>
+          <w:rFonts w:ascii="Arial" w:hAnsi="Arial" w:cs="Arial"/>
+        </w:rPr>
+        <w:t>() }</w:t>
+      </w:r>
+      <w:proofErr w:type="gramEnd"/>
+      <w:r>
+        <w:rPr>
+          <w:rFonts w:ascii="Arial" w:hAnsi="Arial" w:cs="Arial"/>
+        </w:rPr>
+        <w:t xml:space="preserve">} will provide all </w:t>
+      </w:r>
+      <w:proofErr w:type="gramStart"/>
+      <w:r>
+        <w:rPr>
+          <w:rFonts w:ascii="Arial" w:hAnsi="Arial" w:cs="Arial"/>
+        </w:rPr>
+        <w:t>transportation.</w:t>
+      </w:r>
+      <w:r>
+        <w:rPr>
+          <w:rFonts w:ascii="Arial" w:hAnsi="Arial" w:cs="Arial"/>
+        </w:rPr>
+        <w:t>{</w:t>
+      </w:r>
+      <w:proofErr w:type="gramEnd"/>
+      <w:r>
+        <w:rPr>
+          <w:rFonts w:ascii="Arial" w:hAnsi="Arial" w:cs="Arial"/>
+        </w:rPr>
+        <w:t xml:space="preserve">% </w:t>
+      </w:r>
+      <w:proofErr w:type="spellStart"/>
+      <w:r>
+        <w:rPr>
+          <w:rFonts w:ascii="Arial" w:hAnsi="Arial" w:cs="Arial"/>
+        </w:rPr>
+        <w:t>elif</w:t>
+      </w:r>
+      <w:proofErr w:type="spellEnd"/>
+      <w:r>
+        <w:rPr>
+          <w:rFonts w:ascii="Arial" w:hAnsi="Arial" w:cs="Arial"/>
+        </w:rPr>
+        <w:t xml:space="preserve"> transportation == '</w:t>
+      </w:r>
+      <w:proofErr w:type="spellStart"/>
+      <w:r>
+        <w:rPr>
+          <w:rFonts w:ascii="Arial" w:hAnsi="Arial" w:cs="Arial"/>
+        </w:rPr>
+        <w:t>pick_up</w:t>
+      </w:r>
+      <w:proofErr w:type="spellEnd"/>
+      <w:r>
+        <w:rPr>
+          <w:rFonts w:ascii="Arial" w:hAnsi="Arial" w:cs="Arial"/>
+        </w:rPr>
+        <w:t xml:space="preserve">' </w:t>
+      </w:r>
+      <w:proofErr w:type="gramStart"/>
+      <w:r>
+        <w:rPr>
+          <w:rFonts w:ascii="Arial" w:hAnsi="Arial" w:cs="Arial"/>
+        </w:rPr>
+        <w:t>%}Each</w:t>
+      </w:r>
+      <w:proofErr w:type="gramEnd"/>
+      <w:r>
+        <w:rPr>
+          <w:rFonts w:ascii="Arial" w:hAnsi="Arial" w:cs="Arial"/>
+        </w:rPr>
+        <w:t xml:space="preserve"> parent will pick up the {% if children | length &gt; 1 </w:t>
+      </w:r>
+      <w:proofErr w:type="gramStart"/>
+      <w:r>
+        <w:rPr>
+          <w:rFonts w:ascii="Arial" w:hAnsi="Arial" w:cs="Arial"/>
+        </w:rPr>
+        <w:t>%}children</w:t>
+      </w:r>
+      <w:proofErr w:type="gramEnd"/>
+      <w:r>
+        <w:rPr>
+          <w:rFonts w:ascii="Arial" w:hAnsi="Arial" w:cs="Arial"/>
+        </w:rPr>
+        <w:t xml:space="preserve">{% else </w:t>
+      </w:r>
+      <w:proofErr w:type="gramStart"/>
+      <w:r>
+        <w:rPr>
+          <w:rFonts w:ascii="Arial" w:hAnsi="Arial" w:cs="Arial"/>
+        </w:rPr>
+        <w:t>%}child</w:t>
+      </w:r>
+      <w:proofErr w:type="gramEnd"/>
+      <w:r>
+        <w:rPr>
+          <w:rFonts w:ascii="Arial" w:hAnsi="Arial" w:cs="Arial"/>
+        </w:rPr>
+        <w:t xml:space="preserve">{% endif %} at the start of their parenting time. {% </w:t>
+      </w:r>
+      <w:proofErr w:type="spellStart"/>
+      <w:r>
+        <w:rPr>
+          <w:rFonts w:ascii="Arial" w:hAnsi="Arial" w:cs="Arial"/>
+        </w:rPr>
+        <w:t>elif</w:t>
+      </w:r>
+      <w:proofErr w:type="spellEnd"/>
+      <w:r>
+        <w:rPr>
+          <w:rFonts w:ascii="Arial" w:hAnsi="Arial" w:cs="Arial"/>
+        </w:rPr>
+        <w:t xml:space="preserve"> transportation == '</w:t>
+      </w:r>
+      <w:proofErr w:type="spellStart"/>
+      <w:r>
+        <w:rPr>
+          <w:rFonts w:ascii="Arial" w:hAnsi="Arial" w:cs="Arial"/>
+        </w:rPr>
+        <w:t>drop_off</w:t>
+      </w:r>
+      <w:proofErr w:type="spellEnd"/>
+      <w:proofErr w:type="gramStart"/>
+      <w:r>
+        <w:rPr>
+          <w:rFonts w:ascii="Arial" w:hAnsi="Arial" w:cs="Arial"/>
+        </w:rPr>
+        <w:t>' %}</w:t>
+      </w:r>
+      <w:proofErr w:type="gramEnd"/>
+      <w:r>
+        <w:rPr>
+          <w:rFonts w:ascii="Arial" w:hAnsi="Arial" w:cs="Arial"/>
+        </w:rPr>
+        <w:t xml:space="preserve">Each parent will drop off </w:t>
+      </w:r>
+      <w:proofErr w:type="gramStart"/>
+      <w:r>
+        <w:rPr>
+          <w:rFonts w:ascii="Arial" w:hAnsi="Arial" w:cs="Arial"/>
+        </w:rPr>
+        <w:t>the {%</w:t>
+      </w:r>
+      <w:proofErr w:type="gramEnd"/>
+      <w:r>
+        <w:rPr>
+          <w:rFonts w:ascii="Arial" w:hAnsi="Arial" w:cs="Arial"/>
+        </w:rPr>
+        <w:t xml:space="preserve"> if children | length &gt; 1 %}children{% else %}child{% </w:t>
+      </w:r>
+      <w:proofErr w:type="gramStart"/>
+      <w:r>
+        <w:rPr>
+          <w:rFonts w:ascii="Arial" w:hAnsi="Arial" w:cs="Arial"/>
+        </w:rPr>
+        <w:t>endif %}</w:t>
+      </w:r>
+      <w:proofErr w:type="gramEnd"/>
+      <w:r>
+        <w:rPr>
+          <w:rFonts w:ascii="Arial" w:hAnsi="Arial" w:cs="Arial"/>
+        </w:rPr>
+        <w:t xml:space="preserve"> at the end of their parenting time.{% </w:t>
+      </w:r>
+      <w:proofErr w:type="spellStart"/>
+      <w:r>
+        <w:rPr>
+          <w:rFonts w:ascii="Arial" w:hAnsi="Arial" w:cs="Arial"/>
+        </w:rPr>
+        <w:t>elif</w:t>
+      </w:r>
+      <w:proofErr w:type="spellEnd"/>
+      <w:r>
+        <w:rPr>
+          <w:rFonts w:ascii="Arial" w:hAnsi="Arial" w:cs="Arial"/>
+        </w:rPr>
+        <w:t xml:space="preserve"> transportation == 'other</w:t>
+      </w:r>
+      <w:proofErr w:type="gramStart"/>
+      <w:r>
+        <w:rPr>
+          <w:rFonts w:ascii="Arial" w:hAnsi="Arial" w:cs="Arial"/>
+        </w:rPr>
+        <w:t>' %}</w:t>
+      </w:r>
+      <w:proofErr w:type="gramEnd"/>
+      <w:r>
+        <w:rPr>
+          <w:rFonts w:ascii="Arial" w:hAnsi="Arial" w:cs="Arial"/>
+        </w:rPr>
+        <w:t xml:space="preserve">Other: {{ </w:t>
+      </w:r>
+      <w:proofErr w:type="spellStart"/>
+      <w:r>
+        <w:rPr>
+          <w:rFonts w:ascii="Arial" w:hAnsi="Arial" w:cs="Arial"/>
+        </w:rPr>
+        <w:t>transportation_</w:t>
+      </w:r>
+      <w:proofErr w:type="gramStart"/>
+      <w:r>
+        <w:rPr>
+          <w:rFonts w:ascii="Arial" w:hAnsi="Arial" w:cs="Arial"/>
+        </w:rPr>
+        <w:t>other</w:t>
+      </w:r>
+      <w:proofErr w:type="spellEnd"/>
+      <w:r>
+        <w:rPr>
+          <w:rFonts w:ascii="Arial" w:hAnsi="Arial" w:cs="Arial"/>
+        </w:rPr>
+        <w:t xml:space="preserve"> }}{%</w:t>
+      </w:r>
+      <w:proofErr w:type="gramEnd"/>
       <w:r>
         <w:rPr>
           <w:rFonts w:ascii="Arial" w:hAnsi="Arial" w:cs="Arial"/>
@@ -10963,6 +10431,511 @@
           <w:rFonts w:ascii="Arial" w:hAnsi="Arial" w:cs="Arial"/>
         </w:rPr>
       </w:pPr>
+    </w:p>
+    <w:p>
+      <w:pPr>
+        <w:spacing w:after="0"/>
+        <w:rPr>
+          <w:rFonts w:ascii="Arial" w:hAnsi="Arial" w:cs="Arial"/>
+        </w:rPr>
+      </w:pPr>
+      <w:r>
+        <w:rPr>
+          <w:rFonts w:ascii="Arial" w:hAnsi="Arial" w:cs="Arial"/>
+        </w:rPr>
+        <w:t>{%</w:t>
+      </w:r>
+      <w:r>
+        <w:rPr>
+          <w:rFonts w:ascii="Arial" w:hAnsi="Arial" w:cs="Arial"/>
+        </w:rPr>
+        <w:t>p</w:t>
+      </w:r>
+      <w:r>
+        <w:rPr>
+          <w:rFonts w:ascii="Arial" w:hAnsi="Arial" w:cs="Arial"/>
+        </w:rPr>
+        <w:t xml:space="preserve"> </w:t>
+      </w:r>
+      <w:proofErr w:type="gramStart"/>
+      <w:r>
+        <w:rPr>
+          <w:rFonts w:ascii="Arial" w:hAnsi="Arial" w:cs="Arial"/>
+        </w:rPr>
+        <w:t>endif %}</w:t>
+      </w:r>
+      <w:proofErr w:type="gramEnd"/>
+    </w:p>
+    <w:p>
+      <w:pPr>
+        <w:spacing w:after="0"/>
+        <w:rPr>
+          <w:rFonts w:ascii="Arial" w:hAnsi="Arial" w:cs="Arial"/>
+        </w:rPr>
+      </w:pPr>
+      <w:r>
+        <w:rPr>
+          <w:rFonts w:ascii="Arial" w:hAnsi="Arial" w:cs="Arial"/>
+        </w:rPr>
+        <w:lastRenderedPageBreak/>
+        <w:t>{</w:t>
+      </w:r>
+      <w:r>
+        <w:rPr>
+          <w:rFonts w:ascii="Arial" w:hAnsi="Arial" w:cs="Arial"/>
+        </w:rPr>
+        <w:t xml:space="preserve">%p </w:t>
+      </w:r>
+      <w:r>
+        <w:rPr>
+          <w:rFonts w:ascii="Arial" w:hAnsi="Arial" w:cs="Arial"/>
+        </w:rPr>
+        <w:t xml:space="preserve">if </w:t>
+      </w:r>
+      <w:proofErr w:type="spellStart"/>
+      <w:r>
+        <w:rPr>
+          <w:rFonts w:ascii="Arial" w:hAnsi="Arial" w:cs="Arial"/>
+        </w:rPr>
+        <w:t>exchange_</w:t>
+      </w:r>
+      <w:proofErr w:type="gramStart"/>
+      <w:r>
+        <w:rPr>
+          <w:rFonts w:ascii="Arial" w:hAnsi="Arial" w:cs="Arial"/>
+        </w:rPr>
+        <w:t>location</w:t>
+      </w:r>
+      <w:proofErr w:type="spellEnd"/>
+      <w:r>
+        <w:rPr>
+          <w:rFonts w:ascii="Arial" w:hAnsi="Arial" w:cs="Arial"/>
+        </w:rPr>
+        <w:t xml:space="preserve"> %</w:t>
+      </w:r>
+      <w:r>
+        <w:rPr>
+          <w:rFonts w:ascii="Arial" w:hAnsi="Arial" w:cs="Arial"/>
+        </w:rPr>
+        <w:t>}</w:t>
+      </w:r>
+      <w:proofErr w:type="gramEnd"/>
+    </w:p>
+    <w:p>
+      <w:pPr>
+        <w:pStyle w:val="ListParagraph"/>
+        <w:numPr>
+          <w:ilvl w:val="0"/>
+          <w:numId w:val="3"/>
+        </w:numPr>
+        <w:spacing w:after="0"/>
+        <w:rPr>
+          <w:rFonts w:ascii="Arial" w:hAnsi="Arial" w:cs="Arial"/>
+        </w:rPr>
+      </w:pPr>
+      <w:r>
+        <w:rPr>
+          <w:rFonts w:ascii="Arial" w:hAnsi="Arial" w:cs="Arial"/>
+        </w:rPr>
+        <w:t>EXCHANGE OF CHILDREN</w:t>
+      </w:r>
+    </w:p>
+    <w:p>
+      <w:pPr>
+        <w:spacing w:after="0"/>
+        <w:rPr>
+          <w:rFonts w:ascii="Arial" w:hAnsi="Arial" w:cs="Arial"/>
+        </w:rPr>
+      </w:pPr>
+      <w:r>
+        <w:rPr>
+          <w:rFonts w:ascii="Arial" w:hAnsi="Arial" w:cs="Arial"/>
+        </w:rPr>
+        <w:t xml:space="preserve">{% if </w:t>
+      </w:r>
+      <w:proofErr w:type="spellStart"/>
+      <w:r>
+        <w:rPr>
+          <w:rFonts w:ascii="Arial" w:hAnsi="Arial" w:cs="Arial"/>
+        </w:rPr>
+        <w:t>exchange_location</w:t>
+      </w:r>
+      <w:proofErr w:type="spellEnd"/>
+      <w:r>
+        <w:rPr>
+          <w:rFonts w:ascii="Arial" w:hAnsi="Arial" w:cs="Arial"/>
+        </w:rPr>
+        <w:t xml:space="preserve"> == 'homes' </w:t>
+      </w:r>
+      <w:proofErr w:type="gramStart"/>
+      <w:r>
+        <w:rPr>
+          <w:rFonts w:ascii="Arial" w:hAnsi="Arial" w:cs="Arial"/>
+        </w:rPr>
+        <w:t>%}Drop</w:t>
+      </w:r>
+      <w:proofErr w:type="gramEnd"/>
+      <w:r>
+        <w:rPr>
+          <w:rFonts w:ascii="Arial" w:hAnsi="Arial" w:cs="Arial"/>
+        </w:rPr>
+        <w:t xml:space="preserve"> off and pick up of the children will be at each parent's home unless both parties agree in advance to a different meeting </w:t>
+      </w:r>
+      <w:proofErr w:type="gramStart"/>
+      <w:r>
+        <w:rPr>
+          <w:rFonts w:ascii="Arial" w:hAnsi="Arial" w:cs="Arial"/>
+        </w:rPr>
+        <w:t>place.{</w:t>
+      </w:r>
+      <w:proofErr w:type="gramEnd"/>
+      <w:r>
+        <w:rPr>
+          <w:rFonts w:ascii="Arial" w:hAnsi="Arial" w:cs="Arial"/>
+        </w:rPr>
+        <w:t xml:space="preserve">% </w:t>
+      </w:r>
+      <w:proofErr w:type="spellStart"/>
+      <w:r>
+        <w:rPr>
+          <w:rFonts w:ascii="Arial" w:hAnsi="Arial" w:cs="Arial"/>
+        </w:rPr>
+        <w:t>elif</w:t>
+      </w:r>
+      <w:proofErr w:type="spellEnd"/>
+      <w:r>
+        <w:rPr>
+          <w:rFonts w:ascii="Arial" w:hAnsi="Arial" w:cs="Arial"/>
+        </w:rPr>
+        <w:t xml:space="preserve"> </w:t>
+      </w:r>
+      <w:proofErr w:type="spellStart"/>
+      <w:r>
+        <w:rPr>
+          <w:rFonts w:ascii="Arial" w:hAnsi="Arial" w:cs="Arial"/>
+        </w:rPr>
+        <w:t>exchange_location</w:t>
+      </w:r>
+      <w:proofErr w:type="spellEnd"/>
+      <w:r>
+        <w:rPr>
+          <w:rFonts w:ascii="Arial" w:hAnsi="Arial" w:cs="Arial"/>
+        </w:rPr>
+        <w:t xml:space="preserve"> == 'location' </w:t>
+      </w:r>
+      <w:proofErr w:type="gramStart"/>
+      <w:r>
+        <w:rPr>
+          <w:rFonts w:ascii="Arial" w:hAnsi="Arial" w:cs="Arial"/>
+        </w:rPr>
+        <w:t>%}Drop</w:t>
+      </w:r>
+      <w:proofErr w:type="gramEnd"/>
+      <w:r>
+        <w:rPr>
+          <w:rFonts w:ascii="Arial" w:hAnsi="Arial" w:cs="Arial"/>
+        </w:rPr>
+        <w:t xml:space="preserve"> off and pick up will take place at </w:t>
+      </w:r>
+      <w:proofErr w:type="gramStart"/>
+      <w:r>
+        <w:rPr>
+          <w:rFonts w:ascii="Arial" w:hAnsi="Arial" w:cs="Arial"/>
+        </w:rPr>
+        <w:t xml:space="preserve">{{ </w:t>
+      </w:r>
+      <w:proofErr w:type="spellStart"/>
+      <w:r>
+        <w:rPr>
+          <w:rFonts w:ascii="Arial" w:hAnsi="Arial" w:cs="Arial"/>
+        </w:rPr>
+        <w:t>exchange</w:t>
+      </w:r>
+      <w:proofErr w:type="gramEnd"/>
+      <w:r>
+        <w:rPr>
+          <w:rFonts w:ascii="Arial" w:hAnsi="Arial" w:cs="Arial"/>
+        </w:rPr>
+        <w:t>_</w:t>
+      </w:r>
+      <w:proofErr w:type="gramStart"/>
+      <w:r>
+        <w:rPr>
+          <w:rFonts w:ascii="Arial" w:hAnsi="Arial" w:cs="Arial"/>
+        </w:rPr>
+        <w:t>address.location</w:t>
+      </w:r>
+      <w:proofErr w:type="spellEnd"/>
+      <w:proofErr w:type="gramEnd"/>
+      <w:r>
+        <w:rPr>
+          <w:rFonts w:ascii="Arial" w:hAnsi="Arial" w:cs="Arial"/>
+        </w:rPr>
+        <w:t xml:space="preserve"> }}, </w:t>
+      </w:r>
+      <w:proofErr w:type="gramStart"/>
+      <w:r>
+        <w:rPr>
+          <w:rFonts w:ascii="Arial" w:hAnsi="Arial" w:cs="Arial"/>
+        </w:rPr>
+        <w:t xml:space="preserve">{{ </w:t>
+      </w:r>
+      <w:proofErr w:type="spellStart"/>
+      <w:r>
+        <w:rPr>
+          <w:rFonts w:ascii="Arial" w:hAnsi="Arial" w:cs="Arial"/>
+        </w:rPr>
+        <w:t>exchange</w:t>
+      </w:r>
+      <w:proofErr w:type="gramEnd"/>
+      <w:r>
+        <w:rPr>
+          <w:rFonts w:ascii="Arial" w:hAnsi="Arial" w:cs="Arial"/>
+        </w:rPr>
+        <w:t>_</w:t>
+      </w:r>
+      <w:proofErr w:type="gramStart"/>
+      <w:r>
+        <w:rPr>
+          <w:rFonts w:ascii="Arial" w:hAnsi="Arial" w:cs="Arial"/>
+        </w:rPr>
+        <w:t>address.address</w:t>
+      </w:r>
+      <w:proofErr w:type="gramEnd"/>
+      <w:r>
+        <w:rPr>
+          <w:rFonts w:ascii="Arial" w:hAnsi="Arial" w:cs="Arial"/>
+        </w:rPr>
+        <w:t>.on_one_line</w:t>
+      </w:r>
+      <w:proofErr w:type="spellEnd"/>
+      <w:r>
+        <w:rPr>
+          <w:rFonts w:ascii="Arial" w:hAnsi="Arial" w:cs="Arial"/>
+        </w:rPr>
+        <w:t>(bare=True</w:t>
+      </w:r>
+      <w:proofErr w:type="gramStart"/>
+      <w:r>
+        <w:rPr>
+          <w:rFonts w:ascii="Arial" w:hAnsi="Arial" w:cs="Arial"/>
+        </w:rPr>
+        <w:t>) }}.</w:t>
+      </w:r>
+      <w:r>
+        <w:rPr>
+          <w:rFonts w:ascii="Arial" w:hAnsi="Arial" w:cs="Arial"/>
+        </w:rPr>
+        <w:t>{</w:t>
+      </w:r>
+      <w:proofErr w:type="gramEnd"/>
+      <w:r>
+        <w:rPr>
+          <w:rFonts w:ascii="Arial" w:hAnsi="Arial" w:cs="Arial"/>
+        </w:rPr>
+        <w:t>% endif %}</w:t>
+      </w:r>
+    </w:p>
+    <w:p>
+      <w:pPr>
+        <w:spacing w:after="0"/>
+        <w:rPr>
+          <w:rFonts w:ascii="Arial" w:hAnsi="Arial" w:cs="Arial"/>
+        </w:rPr>
+      </w:pPr>
+    </w:p>
+    <w:p>
+      <w:pPr>
+        <w:spacing w:after="0"/>
+        <w:rPr>
+          <w:rFonts w:ascii="Arial" w:hAnsi="Arial" w:cs="Arial"/>
+        </w:rPr>
+      </w:pPr>
+      <w:r>
+        <w:rPr>
+          <w:rFonts w:ascii="Arial" w:hAnsi="Arial" w:cs="Arial"/>
+        </w:rPr>
+        <w:t>{%</w:t>
+      </w:r>
+      <w:r>
+        <w:rPr>
+          <w:rFonts w:ascii="Arial" w:hAnsi="Arial" w:cs="Arial"/>
+        </w:rPr>
+        <w:t>p</w:t>
+      </w:r>
+      <w:r>
+        <w:rPr>
+          <w:rFonts w:ascii="Arial" w:hAnsi="Arial" w:cs="Arial"/>
+        </w:rPr>
+        <w:t xml:space="preserve"> </w:t>
+      </w:r>
+      <w:proofErr w:type="gramStart"/>
+      <w:r>
+        <w:rPr>
+          <w:rFonts w:ascii="Arial" w:hAnsi="Arial" w:cs="Arial"/>
+        </w:rPr>
+        <w:t>endif %}</w:t>
+      </w:r>
+      <w:proofErr w:type="gramEnd"/>
+    </w:p>
+    <w:p>
+      <w:pPr>
+        <w:spacing w:after="0"/>
+        <w:rPr>
+          <w:rFonts w:ascii="Arial" w:hAnsi="Arial" w:cs="Arial"/>
+        </w:rPr>
+      </w:pPr>
+      <w:r>
+        <w:rPr>
+          <w:rFonts w:ascii="Arial" w:hAnsi="Arial" w:cs="Arial"/>
+        </w:rPr>
+        <w:t>{%</w:t>
+      </w:r>
+      <w:r>
+        <w:rPr>
+          <w:rFonts w:ascii="Arial" w:hAnsi="Arial" w:cs="Arial"/>
+        </w:rPr>
+        <w:t>p</w:t>
+      </w:r>
+      <w:r>
+        <w:rPr>
+          <w:rFonts w:ascii="Arial" w:hAnsi="Arial" w:cs="Arial"/>
+        </w:rPr>
+        <w:t xml:space="preserve"> if </w:t>
+      </w:r>
+      <w:proofErr w:type="spellStart"/>
+      <w:r>
+        <w:rPr>
+          <w:rFonts w:ascii="Arial" w:hAnsi="Arial" w:cs="Arial"/>
+        </w:rPr>
+        <w:t>additional_</w:t>
+      </w:r>
+      <w:proofErr w:type="gramStart"/>
+      <w:r>
+        <w:rPr>
+          <w:rFonts w:ascii="Arial" w:hAnsi="Arial" w:cs="Arial"/>
+        </w:rPr>
+        <w:t>time</w:t>
+      </w:r>
+      <w:proofErr w:type="spellEnd"/>
+      <w:r>
+        <w:rPr>
+          <w:rFonts w:ascii="Arial" w:hAnsi="Arial" w:cs="Arial"/>
+        </w:rPr>
+        <w:t xml:space="preserve"> %}</w:t>
+      </w:r>
+      <w:proofErr w:type="gramEnd"/>
+    </w:p>
+    <w:p>
+      <w:pPr>
+        <w:pStyle w:val="ListParagraph"/>
+        <w:numPr>
+          <w:ilvl w:val="0"/>
+          <w:numId w:val="3"/>
+        </w:numPr>
+        <w:spacing w:after="0"/>
+        <w:rPr>
+          <w:rFonts w:ascii="Arial" w:hAnsi="Arial" w:cs="Arial"/>
+        </w:rPr>
+      </w:pPr>
+      <w:r>
+        <w:rPr>
+          <w:rFonts w:ascii="Arial" w:hAnsi="Arial" w:cs="Arial"/>
+        </w:rPr>
+        <w:t>ADDITIONAL INFORMATION</w:t>
+      </w:r>
+    </w:p>
+    <w:p>
+      <w:pPr>
+        <w:spacing w:after="0"/>
+        <w:rPr>
+          <w:rFonts w:ascii="Arial" w:hAnsi="Arial" w:cs="Arial"/>
+        </w:rPr>
+      </w:pPr>
+      <w:proofErr w:type="gramStart"/>
+      <w:r>
+        <w:rPr>
+          <w:rFonts w:ascii="Arial" w:hAnsi="Arial" w:cs="Arial"/>
+        </w:rPr>
+        <w:t xml:space="preserve">{{ </w:t>
+      </w:r>
+      <w:proofErr w:type="spellStart"/>
+      <w:r>
+        <w:rPr>
+          <w:rFonts w:ascii="Arial" w:hAnsi="Arial" w:cs="Arial"/>
+        </w:rPr>
+        <w:t>additional</w:t>
+      </w:r>
+      <w:proofErr w:type="gramEnd"/>
+      <w:r>
+        <w:rPr>
+          <w:rFonts w:ascii="Arial" w:hAnsi="Arial" w:cs="Arial"/>
+        </w:rPr>
+        <w:t>_time_</w:t>
+      </w:r>
+      <w:proofErr w:type="gramStart"/>
+      <w:r>
+        <w:rPr>
+          <w:rFonts w:ascii="Arial" w:hAnsi="Arial" w:cs="Arial"/>
+        </w:rPr>
+        <w:t>details</w:t>
+      </w:r>
+      <w:proofErr w:type="spellEnd"/>
+      <w:r>
+        <w:rPr>
+          <w:rFonts w:ascii="Arial" w:hAnsi="Arial" w:cs="Arial"/>
+        </w:rPr>
+        <w:t xml:space="preserve"> }</w:t>
+      </w:r>
+      <w:proofErr w:type="gramEnd"/>
+      <w:r>
+        <w:rPr>
+          <w:rFonts w:ascii="Arial" w:hAnsi="Arial" w:cs="Arial"/>
+        </w:rPr>
+        <w:t>}</w:t>
+      </w:r>
+    </w:p>
+    <w:p>
+      <w:pPr>
+        <w:spacing w:after="0"/>
+        <w:rPr>
+          <w:rFonts w:ascii="Arial" w:hAnsi="Arial" w:cs="Arial"/>
+        </w:rPr>
+      </w:pPr>
+    </w:p>
+    <w:p>
+      <w:pPr>
+        <w:spacing w:after="0"/>
+        <w:rPr>
+          <w:rFonts w:ascii="Arial" w:hAnsi="Arial" w:cs="Arial"/>
+        </w:rPr>
+      </w:pPr>
+      <w:r>
+        <w:rPr>
+          <w:rFonts w:ascii="Arial" w:hAnsi="Arial" w:cs="Arial"/>
+        </w:rPr>
+        <w:t>{%</w:t>
+      </w:r>
+      <w:r>
+        <w:rPr>
+          <w:rFonts w:ascii="Arial" w:hAnsi="Arial" w:cs="Arial"/>
+        </w:rPr>
+        <w:t>p</w:t>
+      </w:r>
+      <w:r>
+        <w:rPr>
+          <w:rFonts w:ascii="Arial" w:hAnsi="Arial" w:cs="Arial"/>
+        </w:rPr>
+        <w:t xml:space="preserve"> </w:t>
+      </w:r>
+      <w:proofErr w:type="gramStart"/>
+      <w:r>
+        <w:rPr>
+          <w:rFonts w:ascii="Arial" w:hAnsi="Arial" w:cs="Arial"/>
+        </w:rPr>
+        <w:t>endif %}</w:t>
+      </w:r>
+      <w:proofErr w:type="gramEnd"/>
     </w:p>
     <w:p>
       <w:pPr>
@@ -11065,6 +11038,9 @@
         <w:gridCol w:w="4140"/>
       </w:tblGrid>
       <w:tr>
+        <w:trPr>
+          <w:cantSplit/>
+        </w:trPr>
         <w:tc>
           <w:tcPr>
             <w:tcW w:w="5130" w:type="dxa"/>
@@ -11117,6 +11093,9 @@
         </w:tc>
       </w:tr>
       <w:tr>
+        <w:trPr>
+          <w:cantSplit/>
+        </w:trPr>
         <w:tc>
           <w:tcPr>
             <w:tcW w:w="5130" w:type="dxa"/>
@@ -11161,6 +11140,9 @@
         </w:tc>
       </w:tr>
       <w:tr>
+        <w:trPr>
+          <w:cantSplit/>
+        </w:trPr>
         <w:tc>
           <w:tcPr>
             <w:tcW w:w="5130" w:type="dxa"/>
@@ -11205,6 +11187,9 @@
         </w:tc>
       </w:tr>
       <w:tr>
+        <w:trPr>
+          <w:cantSplit/>
+        </w:trPr>
         <w:tc>
           <w:tcPr>
             <w:tcW w:w="5130" w:type="dxa"/>
@@ -11257,6 +11242,9 @@
         </w:tc>
       </w:tr>
       <w:tr>
+        <w:trPr>
+          <w:cantSplit/>
+        </w:trPr>
         <w:tc>
           <w:tcPr>
             <w:tcW w:w="5130" w:type="dxa"/>
@@ -11301,6 +11289,9 @@
         </w:tc>
       </w:tr>
       <w:tr>
+        <w:trPr>
+          <w:cantSplit/>
+        </w:trPr>
         <w:tc>
           <w:tcPr>
             <w:tcW w:w="5130" w:type="dxa"/>
@@ -11345,6 +11336,10 @@
         </w:tc>
       </w:tr>
       <w:tr>
+        <w:trPr>
+          <w:cantSplit/>
+          <w:trHeight w:val="26"/>
+        </w:trPr>
         <w:tc>
           <w:tcPr>
             <w:tcW w:w="5130" w:type="dxa"/>
@@ -11397,24 +11392,6 @@
         </w:tc>
       </w:tr>
     </w:tbl>
-    <w:p>
-      <w:pPr>
-        <w:spacing w:after="0"/>
-        <w:rPr>
-          <w:rFonts w:ascii="Arial" w:hAnsi="Arial" w:cs="Arial"/>
-          <w:u w:val="single"/>
-        </w:rPr>
-      </w:pPr>
-    </w:p>
-    <w:p>
-      <w:pPr>
-        <w:spacing w:after="0"/>
-        <w:rPr>
-          <w:rFonts w:ascii="Arial" w:hAnsi="Arial" w:cs="Arial"/>
-          <w:u w:val="single"/>
-        </w:rPr>
-      </w:pPr>
-    </w:p>
     <w:p>
       <w:pPr>
         <w:spacing w:after="0"/>

</xml_diff>